<commit_message>
Decided to use p-threshold of 0.10 instead of 0.157 after discussion with Carter.  Started creating plots and tables for simulation results
</commit_message>
<xml_diff>
--- a/Project4/Reports/Project4_Data_Analysis_Plan.docx
+++ b/Project4/Reports/Project4_Data_Analysis_Plan.docx
@@ -761,7 +761,13 @@
         <w:pStyle w:val="BlockText"/>
       </w:pPr>
       <w:r>
-        <w:t>How do different variable selection methods perform in identifying true predictors and excluding irrelevant predictors in linear regression models under varying sample sizes and correlation structures?</w:t>
+        <w:t xml:space="preserve">How do different variable selection methods perform in identifying true predictors and excluding irrelevant predictors in linear regression models under varying sample sizes and </w:t>
+      </w:r>
+      <w:r>
+        <w:t>levels of correlation among predictors</w:t>
+      </w:r>
+      <w:r>
+        <w:t>?</w:t>
       </w:r>
     </w:p>
     <w:p>
@@ -786,14 +792,34 @@
         <w:t>approach to the design and reporting of simulation studies</w:t>
       </w:r>
       <w:r>
-        <w:t xml:space="preserve"> (</w:t>
+        <w:t xml:space="preserve"> </w:t>
+      </w:r>
+      <w:r>
+        <w:t xml:space="preserve">by </w:t>
+      </w:r>
+      <w:r>
+        <w:t>Morris et al</w:t>
       </w:r>
       <w:r>
         <w:rPr>
           <w:i/>
           <w:iCs/>
         </w:rPr>
-        <w:t>Morris et al 2018</w:t>
+        <w:t xml:space="preserve"> </w:t>
+      </w:r>
+      <w:r>
+        <w:rPr>
+          <w:i/>
+          <w:iCs/>
+        </w:rPr>
+        <w:t>(</w:t>
+      </w:r>
+      <w:r>
+        <w:rPr>
+          <w:i/>
+          <w:iCs/>
+        </w:rPr>
+        <w:t>2018</w:t>
       </w:r>
       <w:r>
         <w:t>)</w:t>
@@ -847,27 +873,13 @@
         <w:pStyle w:val="FirstParagraph"/>
       </w:pPr>
       <w:r>
-        <w:t xml:space="preserve">Data for this simulation study will be generated using the </w:t>
-      </w:r>
-      <w:proofErr w:type="spellStart"/>
-      <w:r>
-        <w:t>hdrm</w:t>
-      </w:r>
-      <w:proofErr w:type="spellEnd"/>
-      <w:r>
-        <w:t xml:space="preserve"> package available on GitHub</w:t>
-      </w:r>
-      <w:r>
-        <w:t xml:space="preserve"> (</w:t>
+        <w:t>Data for this simulation study will be generated using the hdrm package available on GitHub (</w:t>
       </w:r>
       <w:r>
         <w:t>Breheny, 2025</w:t>
       </w:r>
       <w:r>
-        <w:t>)</w:t>
-      </w:r>
-      <w:r>
-        <w:t>. For each simulated dataset, the outcome will be generated according to the linear regression model:</w:t>
+        <w:t>). For each simulated dataset, the outcome will be generated according to the linear regression model:</w:t>
       </w:r>
     </w:p>
     <w:p>
@@ -1679,7 +1691,105 @@
         </m:r>
       </m:oMath>
       <w:r>
-        <w:t xml:space="preserve">) will be selected using k-fold cross-validation. Two commonly used selection rules will be evaluated: the value of </w:t>
+        <w:t xml:space="preserve">) will be selected using k-fold cross-validation. </w:t>
+      </w:r>
+      <w:r>
+        <w:t xml:space="preserve">Two lambda selection criteria will be examined: </w:t>
+      </w:r>
+      <w:r>
+        <w:t xml:space="preserve"> </w:t>
+      </w:r>
+      <w:r>
+        <w:rPr>
+          <w:rFonts w:eastAsiaTheme="minorEastAsia"/>
+        </w:rPr>
+        <w:t>(</w:t>
+      </w:r>
+      <m:oMath>
+        <m:sSub>
+          <m:sSubPr>
+            <m:ctrlPr>
+              <w:rPr>
+                <w:rFonts w:ascii="Cambria Math" w:hAnsi="Cambria Math"/>
+              </w:rPr>
+            </m:ctrlPr>
+          </m:sSubPr>
+          <m:e>
+            <m:r>
+              <w:rPr>
+                <w:rFonts w:ascii="Cambria Math" w:hAnsi="Cambria Math"/>
+              </w:rPr>
+              <m:t>λ</m:t>
+            </m:r>
+          </m:e>
+          <m:sub>
+            <m:r>
+              <w:rPr>
+                <w:rFonts w:ascii="Cambria Math" w:hAnsi="Cambria Math"/>
+              </w:rPr>
+              <m:t>min</m:t>
+            </m:r>
+          </m:sub>
+        </m:sSub>
+      </m:oMath>
+      <w:r>
+        <w:rPr>
+          <w:rFonts w:eastAsiaTheme="minorEastAsia"/>
+        </w:rPr>
+        <w:t>), which minimizes cross-validation prediction error</w:t>
+      </w:r>
+      <w:r>
+        <w:rPr>
+          <w:rFonts w:eastAsiaTheme="minorEastAsia"/>
+        </w:rPr>
+        <w:t>,</w:t>
+      </w:r>
+      <w:r>
+        <w:rPr>
+          <w:rFonts w:eastAsiaTheme="minorEastAsia"/>
+        </w:rPr>
+        <w:t xml:space="preserve"> and </w:t>
+      </w:r>
+      <w:r>
+        <w:t>(</w:t>
+      </w:r>
+      <m:oMath>
+        <m:sSub>
+          <m:sSubPr>
+            <m:ctrlPr>
+              <w:rPr>
+                <w:rFonts w:ascii="Cambria Math" w:hAnsi="Cambria Math"/>
+              </w:rPr>
+            </m:ctrlPr>
+          </m:sSubPr>
+          <m:e>
+            <m:r>
+              <w:rPr>
+                <w:rFonts w:ascii="Cambria Math" w:hAnsi="Cambria Math"/>
+              </w:rPr>
+              <m:t>λ</m:t>
+            </m:r>
+          </m:e>
+          <m:sub>
+            <m:r>
+              <w:rPr>
+                <w:rFonts w:ascii="Cambria Math" w:hAnsi="Cambria Math"/>
+              </w:rPr>
+              <m:t>1se</m:t>
+            </m:r>
+          </m:sub>
+        </m:sSub>
+      </m:oMath>
+      <w:r>
+        <w:t>)</w:t>
+      </w:r>
+      <w:r>
+        <w:t>, which is the largest value within one standard error of the minimum.</w:t>
+      </w:r>
+    </w:p>
+    <w:p>
+      <w:r>
+        <w:t xml:space="preserve">Two commonly used selection rules will be evaluated: the value of </w:t>
       </w:r>
       <m:oMath>
         <m:r>
@@ -1846,10 +1956,7 @@
         </w:numPr>
       </w:pPr>
       <w:r>
-        <w:t xml:space="preserve">The </w:t>
-      </w:r>
-      <w:r>
-        <w:t>true positive and false positive rates</w:t>
+        <w:t>The true positive and false positive rates</w:t>
       </w:r>
       <w:r>
         <w:t xml:space="preserve"> (target)</w:t>
@@ -1947,6 +2054,55 @@
           <w:szCs w:val="26"/>
         </w:rPr>
         <w:t>Performance Measures</w:t>
+      </w:r>
+    </w:p>
+    <w:p>
+      <w:bookmarkStart w:id="10" w:name="_Toc221895317"/>
+      <w:bookmarkStart w:id="11" w:name="_Toc221895382"/>
+      <w:bookmarkStart w:id="12" w:name="_Toc228353113"/>
+      <w:r>
+        <w:t>Variable selection performance will be assessed across several metrics. The true positive and false positive rates, along with sensitivity, specificity, and confusion matrix summaries, will be evaluated to determine how often the final model includes the five variables known to have an association and how often it includes the 15 that are not associated with the outcome. For variables retained in the final model with known associations, bias of regression coefficient estimates, coverage probability of 95% confidence intervals</w:t>
+      </w:r>
+      <w:r>
+        <w:t xml:space="preserve"> (CI)</w:t>
+      </w:r>
+      <w:r>
+        <w:t xml:space="preserve">, and type I and type II error rates will be evaluated. </w:t>
+      </w:r>
+    </w:p>
+    <w:p>
+      <w:r>
+        <w:t xml:space="preserve">Coverage of 95% </w:t>
+      </w:r>
+      <w:r>
+        <w:t>CIs</w:t>
+      </w:r>
+      <w:r>
+        <w:t xml:space="preserve"> will be evaluated across all variables</w:t>
+      </w:r>
+      <w:r>
+        <w:t xml:space="preserve"> (20)</w:t>
+      </w:r>
+      <w:r>
+        <w:t xml:space="preserve">. For selected variables, coverage is determined by whether the </w:t>
+      </w:r>
+      <w:r>
+        <w:t>CI</w:t>
+      </w:r>
+      <w:r>
+        <w:t xml:space="preserve"> contains the true parameter. For non-selected variables, coefficients are treated as zero</w:t>
+      </w:r>
+      <w:r>
+        <w:t xml:space="preserve"> and f</w:t>
+      </w:r>
+      <w:r>
+        <w:t>ailure to select a true predictor is counted as non-coverage</w:t>
+      </w:r>
+      <w:r>
+        <w:t>. C</w:t>
+      </w:r>
+      <w:r>
+        <w:t>orrectly excluding null predictors is considered coverage.</w:t>
       </w:r>
     </w:p>
     <w:p>
@@ -1958,9 +2114,6 @@
           <w14:ligatures w14:val="none"/>
         </w:rPr>
       </w:pPr>
-      <w:bookmarkStart w:id="10" w:name="_Toc221895317"/>
-      <w:bookmarkStart w:id="11" w:name="_Toc221895382"/>
-      <w:bookmarkStart w:id="12" w:name="_Toc228353113"/>
       <w:r>
         <w:rPr>
           <w:rFonts w:eastAsiaTheme="minorEastAsia"/>
@@ -1968,7 +2121,7 @@
           <w:lang w:eastAsia="zh-CN"/>
           <w14:ligatures w14:val="none"/>
         </w:rPr>
-        <w:t>Variable selection performance will be assessed across several metrics. The true positive and false positive rates, along with sensitivity, specificity, and confusion matrix summaries, will be evaluated to determine how often the final model includes the five variables known to have an association and how often it includes the 15 that are not associated with the outcome. For variables retained in the final model with known associations, bias of regression coefficient estimates, coverage probability of 95% confidence intervals, and type I and type II error rates will be evaluated. Finally, Monte Carlo standard errors will be computed for all performance measures to quantify the uncertainty arising from the finite number of simulation repetitions.</w:t>
+        <w:t>Finally, Monte Carlo standard errors will be computed for all performance measures to quantify the uncertainty arising from the finite number of simulation repetitions.</w:t>
       </w:r>
     </w:p>
     <w:p>
@@ -1976,6 +2129,7 @@
         <w:pStyle w:val="Heading2"/>
       </w:pPr>
       <w:r>
+        <w:lastRenderedPageBreak/>
         <w:t xml:space="preserve">3. </w:t>
       </w:r>
       <w:bookmarkEnd w:id="10"/>
@@ -2061,26 +2215,29 @@
       </w:pPr>
       <w:bookmarkStart w:id="13" w:name="_Toc228353114"/>
       <w:r>
-        <w:lastRenderedPageBreak/>
-        <w:t>4</w:t>
+        <w:t xml:space="preserve">4. </w:t>
+      </w:r>
+      <w:r>
+        <w:t>Reporting</w:t>
+      </w:r>
+      <w:r>
+        <w:t xml:space="preserve"> Results</w:t>
+      </w:r>
+      <w:bookmarkEnd w:id="13"/>
+    </w:p>
+    <w:p>
+      <w:r>
+        <w:t>Results will be presented using a combination of tables and graphical summaries. Tables will report performance metrics for each method across all simulation scenarios.</w:t>
+      </w:r>
+      <w:r>
+        <w:t xml:space="preserve"> </w:t>
+      </w:r>
+      <w:r>
+        <w:t>Graphical displays may include plots of selection probabilities, false positive rates, and bias across varying conditions</w:t>
       </w:r>
       <w:r>
         <w:t xml:space="preserve">. </w:t>
       </w:r>
-      <w:r>
-        <w:t>Reporting</w:t>
-      </w:r>
-      <w:r>
-        <w:t xml:space="preserve"> Results</w:t>
-      </w:r>
-      <w:bookmarkEnd w:id="13"/>
-    </w:p>
-    <w:p>
-      <w:r>
-        <w:t>Results will be presented using a combination of tables and graphical summaries. Tables will report performance metrics for each method across all simulation scenarios. Graphical displays may include plots of selection probabilities, false positive rates, and bias across varying conditions.</w:t>
-      </w:r>
-    </w:p>
-    <w:p>
       <w:r>
         <w:t xml:space="preserve">Comparisons between methods will focus on trade-offs between variable selection accuracy, estimation bias, and </w:t>
       </w:r>
@@ -2172,21 +2329,12 @@
       <w:r>
         <w:t xml:space="preserve">Breheny, P. (2025). </w:t>
       </w:r>
-      <w:proofErr w:type="spellStart"/>
       <w:r>
         <w:rPr>
           <w:i/>
           <w:iCs/>
         </w:rPr>
-        <w:t>hdrm</w:t>
-      </w:r>
-      <w:proofErr w:type="spellEnd"/>
-      <w:r>
-        <w:rPr>
-          <w:i/>
-          <w:iCs/>
-        </w:rPr>
-        <w:t>: High-dimensional regression modeling</w:t>
+        <w:t>hdrm: High-dimensional regression modeling</w:t>
       </w:r>
       <w:r>
         <w:t xml:space="preserve"> (Version 0.17.1) [R package]. GitHub. https://github.com/pbreheny/hdrm</w:t>

</xml_diff>

<commit_message>
Simulation results are now being reviewed. Experimenting with different tables and plots to determine best way to present the simulation results. Heatmap appears to be the best so far to conserve space. Updates to final reports results section have been made.
</commit_message>
<xml_diff>
--- a/Project4/Reports/Project4_Data_Analysis_Plan.docx
+++ b/Project4/Reports/Project4_Data_Analysis_Plan.docx
@@ -16,6 +16,7 @@
       <w:bookmarkStart w:id="1" w:name="_Toc221895378"/>
       <w:bookmarkStart w:id="2" w:name="_Toc222223983"/>
       <w:bookmarkStart w:id="3" w:name="_Toc228353110"/>
+      <w:bookmarkStart w:id="4" w:name="_Toc228694927"/>
       <w:r>
         <w:rPr>
           <w:b/>
@@ -38,7 +39,7 @@
           <w:bCs/>
           <w:color w:val="000000" w:themeColor="text1"/>
         </w:rPr>
-        <w:t>3</w:t>
+        <w:t>4</w:t>
       </w:r>
       <w:r>
         <w:rPr>
@@ -60,6 +61,7 @@
       <w:bookmarkEnd w:id="1"/>
       <w:bookmarkEnd w:id="2"/>
       <w:bookmarkEnd w:id="3"/>
+      <w:bookmarkEnd w:id="4"/>
     </w:p>
     <w:p>
       <w:pPr>
@@ -224,10 +226,9 @@
               <w:noProof/>
               <w:sz w:val="24"/>
               <w:szCs w:val="24"/>
-              <w:lang w:eastAsia="zh-CN"/>
             </w:rPr>
           </w:pPr>
-          <w:hyperlink w:anchor="_Toc228353111" w:history="1">
+          <w:hyperlink w:anchor="_Toc228694928" w:history="1">
             <w:r>
               <w:rPr>
                 <w:rStyle w:val="Hyperlink"/>
@@ -254,7 +255,7 @@
                 <w:noProof/>
                 <w:webHidden/>
               </w:rPr>
-              <w:instrText xml:space="preserve"> PAGEREF _Toc228353111 \h </w:instrText>
+              <w:instrText xml:space="preserve"> PAGEREF _Toc228694928 \h </w:instrText>
             </w:r>
             <w:r>
               <w:rPr>
@@ -298,10 +299,9 @@
               <w:noProof/>
               <w:sz w:val="24"/>
               <w:szCs w:val="24"/>
-              <w:lang w:eastAsia="zh-CN"/>
             </w:rPr>
           </w:pPr>
-          <w:hyperlink w:anchor="_Toc228353112" w:history="1">
+          <w:hyperlink w:anchor="_Toc228694929" w:history="1">
             <w:r>
               <w:rPr>
                 <w:rStyle w:val="Hyperlink"/>
@@ -328,7 +328,7 @@
                 <w:noProof/>
                 <w:webHidden/>
               </w:rPr>
-              <w:instrText xml:space="preserve"> PAGEREF _Toc228353112 \h </w:instrText>
+              <w:instrText xml:space="preserve"> PAGEREF _Toc228694929 \h </w:instrText>
             </w:r>
             <w:r>
               <w:rPr>
@@ -372,16 +372,15 @@
               <w:noProof/>
               <w:sz w:val="24"/>
               <w:szCs w:val="24"/>
-              <w:lang w:eastAsia="zh-CN"/>
             </w:rPr>
           </w:pPr>
-          <w:hyperlink w:anchor="_Toc228353113" w:history="1">
+          <w:hyperlink w:anchor="_Toc228694930" w:history="1">
             <w:r>
               <w:rPr>
                 <w:rStyle w:val="Hyperlink"/>
                 <w:noProof/>
               </w:rPr>
-              <w:t>3. Analysis Plan</w:t>
+              <w:t>3. Analysis &amp; Reporting</w:t>
             </w:r>
             <w:r>
               <w:rPr>
@@ -402,7 +401,7 @@
                 <w:noProof/>
                 <w:webHidden/>
               </w:rPr>
-              <w:instrText xml:space="preserve"> PAGEREF _Toc228353113 \h </w:instrText>
+              <w:instrText xml:space="preserve"> PAGEREF _Toc228694930 \h </w:instrText>
             </w:r>
             <w:r>
               <w:rPr>
@@ -446,84 +445,9 @@
               <w:noProof/>
               <w:sz w:val="24"/>
               <w:szCs w:val="24"/>
-              <w:lang w:eastAsia="zh-CN"/>
             </w:rPr>
           </w:pPr>
-          <w:hyperlink w:anchor="_Toc228353114" w:history="1">
-            <w:r>
-              <w:rPr>
-                <w:rStyle w:val="Hyperlink"/>
-                <w:noProof/>
-              </w:rPr>
-              <w:t>4. Presentation of Results</w:t>
-            </w:r>
-            <w:r>
-              <w:rPr>
-                <w:noProof/>
-                <w:webHidden/>
-              </w:rPr>
-              <w:tab/>
-            </w:r>
-            <w:r>
-              <w:rPr>
-                <w:noProof/>
-                <w:webHidden/>
-              </w:rPr>
-              <w:fldChar w:fldCharType="begin"/>
-            </w:r>
-            <w:r>
-              <w:rPr>
-                <w:noProof/>
-                <w:webHidden/>
-              </w:rPr>
-              <w:instrText xml:space="preserve"> PAGEREF _Toc228353114 \h </w:instrText>
-            </w:r>
-            <w:r>
-              <w:rPr>
-                <w:noProof/>
-                <w:webHidden/>
-              </w:rPr>
-            </w:r>
-            <w:r>
-              <w:rPr>
-                <w:noProof/>
-                <w:webHidden/>
-              </w:rPr>
-              <w:fldChar w:fldCharType="separate"/>
-            </w:r>
-            <w:r>
-              <w:rPr>
-                <w:noProof/>
-                <w:webHidden/>
-              </w:rPr>
-              <w:t>3</w:t>
-            </w:r>
-            <w:r>
-              <w:rPr>
-                <w:noProof/>
-                <w:webHidden/>
-              </w:rPr>
-              <w:fldChar w:fldCharType="end"/>
-            </w:r>
-          </w:hyperlink>
-        </w:p>
-        <w:p>
-          <w:pPr>
-            <w:pStyle w:val="TOC2"/>
-            <w:tabs>
-              <w:tab w:val="right" w:leader="dot" w:pos="9350"/>
-            </w:tabs>
-            <w:rPr>
-              <w:rFonts w:eastAsiaTheme="minorEastAsia"/>
-              <w:b w:val="0"/>
-              <w:bCs w:val="0"/>
-              <w:noProof/>
-              <w:sz w:val="24"/>
-              <w:szCs w:val="24"/>
-              <w:lang w:eastAsia="zh-CN"/>
-            </w:rPr>
-          </w:pPr>
-          <w:hyperlink w:anchor="_Toc228353115" w:history="1">
+          <w:hyperlink w:anchor="_Toc228694931" w:history="1">
             <w:r>
               <w:rPr>
                 <w:rStyle w:val="Hyperlink"/>
@@ -550,7 +474,7 @@
                 <w:noProof/>
                 <w:webHidden/>
               </w:rPr>
-              <w:instrText xml:space="preserve"> PAGEREF _Toc228353115 \h </w:instrText>
+              <w:instrText xml:space="preserve"> PAGEREF _Toc228694931 \h </w:instrText>
             </w:r>
             <w:r>
               <w:rPr>
@@ -644,17 +568,17 @@
       <w:pPr>
         <w:pStyle w:val="Heading2"/>
       </w:pPr>
-      <w:bookmarkStart w:id="4" w:name="_Toc221895315"/>
+      <w:bookmarkStart w:id="5" w:name="_Toc221895315"/>
     </w:p>
     <w:p/>
     <w:p>
-      <w:bookmarkStart w:id="5" w:name="_Toc221895380"/>
+      <w:bookmarkStart w:id="6" w:name="_Toc221895380"/>
     </w:p>
     <w:p>
       <w:pPr>
         <w:pStyle w:val="Heading2"/>
       </w:pPr>
-      <w:bookmarkStart w:id="6" w:name="_Toc228353111"/>
+      <w:bookmarkStart w:id="7" w:name="_Toc228694928"/>
       <w:r>
         <w:lastRenderedPageBreak/>
         <w:t>1. I</w:t>
@@ -662,34 +586,16 @@
       <w:r>
         <w:t>ntroduction</w:t>
       </w:r>
-      <w:bookmarkEnd w:id="4"/>
       <w:bookmarkEnd w:id="5"/>
       <w:bookmarkEnd w:id="6"/>
+      <w:bookmarkEnd w:id="7"/>
     </w:p>
     <w:p>
       <w:pPr>
         <w:pStyle w:val="FirstParagraph"/>
       </w:pPr>
       <w:r>
-        <w:t xml:space="preserve">Simulation studies </w:t>
-      </w:r>
-      <w:r>
-        <w:t>enable the evaluation of model performance, testing procedures, and theoretical properties under controlled conditions. This</w:t>
-      </w:r>
-      <w:r>
-        <w:t xml:space="preserve"> allows </w:t>
-      </w:r>
-      <w:r>
-        <w:t>us to understand and assess</w:t>
-      </w:r>
-      <w:r>
-        <w:t xml:space="preserve"> statistical properties such as bias, variability, variable selection accuracy, and confidence interval </w:t>
-      </w:r>
-      <w:r>
-        <w:t>coverage</w:t>
-      </w:r>
-      <w:r>
-        <w:t>.</w:t>
+        <w:t>Simulation studies allow evaluation of statistical methods under controlled conditions. This project compares several variable selection methods in linear regression, focusing on their ability to correctly identify relevant predictors and exclude irrelevant ones.</w:t>
       </w:r>
     </w:p>
     <w:p>
@@ -783,19 +689,15 @@
         <w:pStyle w:val="BodyText"/>
       </w:pPr>
       <w:r>
-        <w:t>This simulation study is structured using the ADEMP framework (Aims, Data-generating mechanisms, Estimands, Methods, Performance measures), which provides a</w:t>
-      </w:r>
-      <w:r>
-        <w:t xml:space="preserve">n </w:t>
-      </w:r>
-      <w:r>
-        <w:t>approach to the design and reporting of simulation studies</w:t>
-      </w:r>
-      <w:r>
-        <w:t xml:space="preserve"> </w:t>
-      </w:r>
-      <w:r>
-        <w:t xml:space="preserve">by </w:t>
+        <w:t xml:space="preserve">This simulation study will be structured using the ADEMP framework (Aims, Data-generating mechanisms, </w:t>
+      </w:r>
+      <w:proofErr w:type="spellStart"/>
+      <w:r>
+        <w:t>Estimands</w:t>
+      </w:r>
+      <w:proofErr w:type="spellEnd"/>
+      <w:r>
+        <w:t xml:space="preserve">, Methods, Performance measures), which provides an approach to the design and reporting of simulation studies by </w:t>
       </w:r>
       <w:r>
         <w:t>Morris et al</w:t>
@@ -822,28 +724,25 @@
         <w:t>2018</w:t>
       </w:r>
       <w:r>
-        <w:t>)</w:t>
-      </w:r>
-      <w:r>
-        <w:t>.</w:t>
+        <w:t>).</w:t>
       </w:r>
     </w:p>
     <w:p>
       <w:pPr>
         <w:pStyle w:val="Heading2"/>
       </w:pPr>
-      <w:bookmarkStart w:id="7" w:name="_Toc221895316"/>
-      <w:bookmarkStart w:id="8" w:name="_Toc221895381"/>
-      <w:bookmarkStart w:id="9" w:name="_Toc228353112"/>
+      <w:bookmarkStart w:id="8" w:name="_Toc221895316"/>
+      <w:bookmarkStart w:id="9" w:name="_Toc221895381"/>
+      <w:bookmarkStart w:id="10" w:name="_Toc228694929"/>
       <w:r>
         <w:t xml:space="preserve">2. </w:t>
       </w:r>
       <w:r>
         <w:t>Methods</w:t>
       </w:r>
-      <w:bookmarkEnd w:id="7"/>
       <w:bookmarkEnd w:id="8"/>
       <w:bookmarkEnd w:id="9"/>
+      <w:bookmarkEnd w:id="10"/>
     </w:p>
     <w:p>
       <w:pPr>
@@ -869,593 +768,52 @@
       </w:r>
     </w:p>
     <w:p>
-      <w:pPr>
-        <w:pStyle w:val="FirstParagraph"/>
-      </w:pPr>
-      <w:r>
-        <w:t>Data for this simulation study will be generated using the hdrm package available on GitHub (</w:t>
-      </w:r>
-      <w:r>
-        <w:t>Breheny, 2025</w:t>
-      </w:r>
-      <w:r>
-        <w:t>). For each simulated dataset, the outcome will be generated according to the linear regression model:</w:t>
-      </w:r>
-    </w:p>
-    <w:p>
-      <w:pPr>
-        <w:pStyle w:val="BodyText"/>
-      </w:pPr>
-      <m:oMathPara>
-        <m:oMathParaPr>
-          <m:jc m:val="center"/>
-        </m:oMathParaPr>
-        <m:oMath>
-          <m:r>
-            <w:rPr>
-              <w:rFonts w:ascii="Cambria Math" w:hAnsi="Cambria Math"/>
-            </w:rPr>
-            <m:t>Y</m:t>
-          </m:r>
-          <m:r>
-            <m:rPr>
-              <m:sty m:val="p"/>
-            </m:rPr>
-            <w:rPr>
-              <w:rFonts w:ascii="Cambria Math" w:hAnsi="Cambria Math"/>
-            </w:rPr>
-            <m:t>=</m:t>
-          </m:r>
-          <m:r>
-            <w:rPr>
-              <w:rFonts w:ascii="Cambria Math" w:hAnsi="Cambria Math"/>
-            </w:rPr>
-            <m:t>Xβ</m:t>
-          </m:r>
-          <m:r>
-            <m:rPr>
-              <m:sty m:val="p"/>
-            </m:rPr>
-            <w:rPr>
-              <w:rFonts w:ascii="Cambria Math" w:hAnsi="Cambria Math"/>
-            </w:rPr>
-            <m:t>+</m:t>
-          </m:r>
-          <m:r>
-            <w:rPr>
-              <w:rFonts w:ascii="Cambria Math" w:hAnsi="Cambria Math"/>
-            </w:rPr>
-            <m:t>ϵ</m:t>
-          </m:r>
-        </m:oMath>
-      </m:oMathPara>
-    </w:p>
-    <w:p>
-      <w:pPr>
-        <w:pStyle w:val="FirstParagraph"/>
-      </w:pPr>
-      <w:r>
-        <w:t>where (</w:t>
-      </w:r>
-      <m:oMath>
-        <m:r>
-          <w:rPr>
-            <w:rFonts w:ascii="Cambria Math" w:hAnsi="Cambria Math"/>
-          </w:rPr>
-          <m:t>Y</m:t>
-        </m:r>
-      </m:oMath>
-      <w:r>
-        <w:t>) is the outcome variable, (</w:t>
-      </w:r>
-      <m:oMath>
-        <m:r>
-          <w:rPr>
-            <w:rFonts w:ascii="Cambria Math" w:hAnsi="Cambria Math"/>
-          </w:rPr>
-          <m:t>X</m:t>
-        </m:r>
-      </m:oMath>
-      <w:r>
-        <w:t xml:space="preserve">) </w:t>
-      </w:r>
-      <w:r>
-        <w:t>is an (</w:t>
-      </w:r>
-      <m:oMath>
-        <m:r>
-          <w:rPr>
-            <w:rFonts w:ascii="Cambria Math" w:hAnsi="Cambria Math"/>
-          </w:rPr>
-          <m:t>N</m:t>
-        </m:r>
-        <m:r>
-          <m:rPr>
-            <m:sty m:val="p"/>
-          </m:rPr>
-          <w:rPr>
-            <w:rFonts w:ascii="Cambria Math" w:hAnsi="Cambria Math"/>
-          </w:rPr>
-          <m:t>×</m:t>
-        </m:r>
-        <m:r>
-          <w:rPr>
-            <w:rFonts w:ascii="Cambria Math" w:hAnsi="Cambria Math"/>
-          </w:rPr>
-          <m:t>20</m:t>
-        </m:r>
-      </m:oMath>
-      <w:r>
-        <w:t>) matrix</w:t>
-      </w:r>
-      <w:r>
-        <w:t>, (</w:t>
-      </w:r>
-      <m:oMath>
-        <m:r>
-          <w:rPr>
-            <w:rFonts w:ascii="Cambria Math" w:hAnsi="Cambria Math"/>
-          </w:rPr>
-          <m:t>β</m:t>
-        </m:r>
-      </m:oMath>
-      <w:r>
-        <w:t xml:space="preserve">) is the vector of regression coefficients, and </w:t>
-      </w:r>
-      <w:r>
-        <w:t>(</w:t>
-      </w:r>
-      <m:oMath>
-        <m:r>
-          <w:rPr>
-            <w:rFonts w:ascii="Cambria Math" w:hAnsi="Cambria Math"/>
-          </w:rPr>
-          <m:t>ϵ</m:t>
-        </m:r>
-        <m:r>
-          <m:rPr>
-            <m:sty m:val="p"/>
-          </m:rPr>
-          <w:rPr>
-            <w:rFonts w:ascii="Cambria Math" w:hAnsi="Cambria Math"/>
-          </w:rPr>
-          <m:t>∼</m:t>
-        </m:r>
-        <m:r>
-          <w:rPr>
-            <w:rFonts w:ascii="Cambria Math" w:hAnsi="Cambria Math"/>
-          </w:rPr>
-          <m:t>N</m:t>
-        </m:r>
-        <m:r>
-          <m:rPr>
-            <m:sty m:val="p"/>
-          </m:rPr>
-          <w:rPr>
-            <w:rFonts w:ascii="Cambria Math" w:hAnsi="Cambria Math"/>
-          </w:rPr>
-          <m:t>(</m:t>
-        </m:r>
-        <m:r>
-          <w:rPr>
-            <w:rFonts w:ascii="Cambria Math" w:hAnsi="Cambria Math"/>
-          </w:rPr>
-          <m:t>0</m:t>
-        </m:r>
-        <m:r>
-          <m:rPr>
-            <m:sty m:val="p"/>
-          </m:rPr>
-          <w:rPr>
-            <w:rFonts w:ascii="Cambria Math" w:hAnsi="Cambria Math"/>
-          </w:rPr>
-          <m:t>,</m:t>
-        </m:r>
-        <m:sSup>
-          <m:sSupPr>
-            <m:ctrlPr>
-              <w:rPr>
-                <w:rFonts w:ascii="Cambria Math" w:hAnsi="Cambria Math"/>
-              </w:rPr>
-            </m:ctrlPr>
-          </m:sSupPr>
-          <m:e>
-            <m:r>
-              <w:rPr>
-                <w:rFonts w:ascii="Cambria Math" w:hAnsi="Cambria Math"/>
-              </w:rPr>
-              <m:t>σ</m:t>
-            </m:r>
-          </m:e>
-          <m:sup>
-            <m:r>
-              <w:rPr>
-                <w:rFonts w:ascii="Cambria Math" w:hAnsi="Cambria Math"/>
-              </w:rPr>
-              <m:t>2</m:t>
-            </m:r>
-          </m:sup>
-        </m:sSup>
-        <m:r>
-          <m:rPr>
-            <m:sty m:val="p"/>
-          </m:rPr>
-          <w:rPr>
-            <w:rFonts w:ascii="Cambria Math" w:hAnsi="Cambria Math"/>
-          </w:rPr>
-          <m:t>)</m:t>
-        </m:r>
-      </m:oMath>
-      <w:r>
-        <w:t>.</w:t>
-      </w:r>
-    </w:p>
-    <w:p>
-      <w:pPr>
-        <w:pStyle w:val="BodyText"/>
-      </w:pPr>
-      <w:r>
-        <w:t>The true regression coefficients for the five relevant predictors will be specified as:</w:t>
-      </w:r>
-    </w:p>
-    <w:p>
-      <w:pPr>
-        <w:pStyle w:val="BodyText"/>
-      </w:pPr>
-      <m:oMathPara>
-        <m:oMathParaPr>
-          <m:jc m:val="center"/>
-        </m:oMathParaPr>
-        <m:oMath>
-          <m:r>
-            <w:rPr>
-              <w:rFonts w:ascii="Cambria Math" w:hAnsi="Cambria Math"/>
-            </w:rPr>
-            <m:t>β</m:t>
-          </m:r>
-          <m:r>
-            <m:rPr>
-              <m:sty m:val="p"/>
-            </m:rPr>
-            <w:rPr>
-              <w:rFonts w:ascii="Cambria Math" w:hAnsi="Cambria Math"/>
-            </w:rPr>
-            <m:t>=</m:t>
-          </m:r>
-          <m:d>
-            <m:dPr>
-              <m:ctrlPr>
-                <w:rPr>
-                  <w:rFonts w:ascii="Cambria Math" w:hAnsi="Cambria Math"/>
-                </w:rPr>
-              </m:ctrlPr>
-            </m:dPr>
-            <m:e>
-              <m:f>
-                <m:fPr>
-                  <m:ctrlPr>
-                    <w:rPr>
-                      <w:rFonts w:ascii="Cambria Math" w:hAnsi="Cambria Math"/>
-                    </w:rPr>
-                  </m:ctrlPr>
-                </m:fPr>
-                <m:num>
-                  <m:r>
-                    <w:rPr>
-                      <w:rFonts w:ascii="Cambria Math" w:hAnsi="Cambria Math"/>
-                    </w:rPr>
-                    <m:t>0.5</m:t>
-                  </m:r>
-                </m:num>
-                <m:den>
-                  <m:r>
-                    <w:rPr>
-                      <w:rFonts w:ascii="Cambria Math" w:hAnsi="Cambria Math"/>
-                    </w:rPr>
-                    <m:t>3</m:t>
-                  </m:r>
-                </m:den>
-              </m:f>
-              <m:r>
-                <m:rPr>
-                  <m:sty m:val="p"/>
-                </m:rPr>
-                <w:rPr>
-                  <w:rFonts w:ascii="Cambria Math" w:hAnsi="Cambria Math"/>
-                </w:rPr>
-                <m:t>,</m:t>
-              </m:r>
-              <m:f>
-                <m:fPr>
-                  <m:ctrlPr>
-                    <w:rPr>
-                      <w:rFonts w:ascii="Cambria Math" w:hAnsi="Cambria Math"/>
-                    </w:rPr>
-                  </m:ctrlPr>
-                </m:fPr>
-                <m:num>
-                  <m:r>
-                    <w:rPr>
-                      <w:rFonts w:ascii="Cambria Math" w:hAnsi="Cambria Math"/>
-                    </w:rPr>
-                    <m:t>1</m:t>
-                  </m:r>
-                </m:num>
-                <m:den>
-                  <m:r>
-                    <w:rPr>
-                      <w:rFonts w:ascii="Cambria Math" w:hAnsi="Cambria Math"/>
-                    </w:rPr>
-                    <m:t>3</m:t>
-                  </m:r>
-                </m:den>
-              </m:f>
-              <m:r>
-                <m:rPr>
-                  <m:sty m:val="p"/>
-                </m:rPr>
-                <w:rPr>
-                  <w:rFonts w:ascii="Cambria Math" w:hAnsi="Cambria Math"/>
-                </w:rPr>
-                <m:t>,</m:t>
-              </m:r>
-              <m:f>
-                <m:fPr>
-                  <m:ctrlPr>
-                    <w:rPr>
-                      <w:rFonts w:ascii="Cambria Math" w:hAnsi="Cambria Math"/>
-                    </w:rPr>
-                  </m:ctrlPr>
-                </m:fPr>
-                <m:num>
-                  <m:r>
-                    <w:rPr>
-                      <w:rFonts w:ascii="Cambria Math" w:hAnsi="Cambria Math"/>
-                    </w:rPr>
-                    <m:t>1.5</m:t>
-                  </m:r>
-                </m:num>
-                <m:den>
-                  <m:r>
-                    <w:rPr>
-                      <w:rFonts w:ascii="Cambria Math" w:hAnsi="Cambria Math"/>
-                    </w:rPr>
-                    <m:t>3</m:t>
-                  </m:r>
-                </m:den>
-              </m:f>
-              <m:r>
-                <m:rPr>
-                  <m:sty m:val="p"/>
-                </m:rPr>
-                <w:rPr>
-                  <w:rFonts w:ascii="Cambria Math" w:hAnsi="Cambria Math"/>
-                </w:rPr>
-                <m:t>,</m:t>
-              </m:r>
-              <m:f>
-                <m:fPr>
-                  <m:ctrlPr>
-                    <w:rPr>
-                      <w:rFonts w:ascii="Cambria Math" w:hAnsi="Cambria Math"/>
-                    </w:rPr>
-                  </m:ctrlPr>
-                </m:fPr>
-                <m:num>
-                  <m:r>
-                    <w:rPr>
-                      <w:rFonts w:ascii="Cambria Math" w:hAnsi="Cambria Math"/>
-                    </w:rPr>
-                    <m:t>2</m:t>
-                  </m:r>
-                </m:num>
-                <m:den>
-                  <m:r>
-                    <w:rPr>
-                      <w:rFonts w:ascii="Cambria Math" w:hAnsi="Cambria Math"/>
-                    </w:rPr>
-                    <m:t>3</m:t>
-                  </m:r>
-                </m:den>
-              </m:f>
-              <m:r>
-                <m:rPr>
-                  <m:sty m:val="p"/>
-                </m:rPr>
-                <w:rPr>
-                  <w:rFonts w:ascii="Cambria Math" w:hAnsi="Cambria Math"/>
-                </w:rPr>
-                <m:t>,</m:t>
-              </m:r>
-              <m:f>
-                <m:fPr>
-                  <m:ctrlPr>
-                    <w:rPr>
-                      <w:rFonts w:ascii="Cambria Math" w:hAnsi="Cambria Math"/>
-                    </w:rPr>
-                  </m:ctrlPr>
-                </m:fPr>
-                <m:num>
-                  <m:r>
-                    <w:rPr>
-                      <w:rFonts w:ascii="Cambria Math" w:hAnsi="Cambria Math"/>
-                    </w:rPr>
-                    <m:t>2.5</m:t>
-                  </m:r>
-                </m:num>
-                <m:den>
-                  <m:r>
-                    <w:rPr>
-                      <w:rFonts w:ascii="Cambria Math" w:hAnsi="Cambria Math"/>
-                    </w:rPr>
-                    <m:t>3</m:t>
-                  </m:r>
-                </m:den>
-              </m:f>
-            </m:e>
-          </m:d>
-        </m:oMath>
-      </m:oMathPara>
-    </w:p>
-    <w:p>
-      <w:pPr>
-        <w:pStyle w:val="FirstParagraph"/>
-      </w:pPr>
-      <w:r>
-        <w:lastRenderedPageBreak/>
-        <w:t>All predictors will be generated as continuous variables.</w:t>
-      </w:r>
-    </w:p>
-    <w:p>
-      <w:pPr>
-        <w:pStyle w:val="BodyText"/>
-      </w:pPr>
-      <w:r>
-        <w:t>To evaluate the impact of predictor correlation, an exchangeable correlation structure will be imposed such that all pairwise correlations between predictors are equal to a constant value (</w:t>
-      </w:r>
-      <m:oMath>
-        <m:r>
-          <w:rPr>
-            <w:rFonts w:ascii="Cambria Math" w:hAnsi="Cambria Math"/>
-          </w:rPr>
-          <m:t>ρ</m:t>
-        </m:r>
-      </m:oMath>
-      <w:r>
-        <w:t>). Three correlation levels will be considered:</w:t>
-      </w:r>
-    </w:p>
-    <w:p>
-      <w:pPr>
-        <w:pStyle w:val="Compact"/>
-        <w:numPr>
-          <w:ilvl w:val="0"/>
-          <w:numId w:val="7"/>
-        </w:numPr>
-      </w:pPr>
-      <m:oMath>
-        <m:r>
-          <w:rPr>
-            <w:rFonts w:ascii="Cambria Math" w:hAnsi="Cambria Math"/>
-          </w:rPr>
-          <m:t>ρ</m:t>
-        </m:r>
-        <m:r>
-          <m:rPr>
-            <m:sty m:val="p"/>
-          </m:rPr>
-          <w:rPr>
-            <w:rFonts w:ascii="Cambria Math" w:hAnsi="Cambria Math"/>
-          </w:rPr>
-          <m:t>=</m:t>
-        </m:r>
-        <m:r>
-          <w:rPr>
-            <w:rFonts w:ascii="Cambria Math" w:hAnsi="Cambria Math"/>
-          </w:rPr>
-          <m:t>0</m:t>
-        </m:r>
-      </m:oMath>
-      <w:r>
-        <w:t xml:space="preserve">  (independent predictors)</w:t>
-      </w:r>
-    </w:p>
-    <w:p>
-      <w:pPr>
-        <w:pStyle w:val="Compact"/>
-        <w:numPr>
-          <w:ilvl w:val="0"/>
-          <w:numId w:val="7"/>
-        </w:numPr>
-      </w:pPr>
-      <m:oMath>
-        <m:r>
-          <w:rPr>
-            <w:rFonts w:ascii="Cambria Math" w:hAnsi="Cambria Math"/>
-          </w:rPr>
-          <m:t>ρ</m:t>
-        </m:r>
-        <m:r>
-          <m:rPr>
-            <m:sty m:val="p"/>
-          </m:rPr>
-          <w:rPr>
-            <w:rFonts w:ascii="Cambria Math" w:hAnsi="Cambria Math"/>
-          </w:rPr>
-          <m:t>=</m:t>
-        </m:r>
-        <m:r>
-          <w:rPr>
-            <w:rFonts w:ascii="Cambria Math" w:hAnsi="Cambria Math"/>
-          </w:rPr>
-          <m:t>0.35</m:t>
-        </m:r>
-      </m:oMath>
-      <w:r>
-        <w:t xml:space="preserve"> (moderate correlation)</w:t>
-      </w:r>
-    </w:p>
-    <w:p>
-      <w:pPr>
-        <w:pStyle w:val="Compact"/>
-        <w:numPr>
-          <w:ilvl w:val="0"/>
-          <w:numId w:val="7"/>
-        </w:numPr>
-      </w:pPr>
-      <m:oMath>
-        <m:r>
-          <w:rPr>
-            <w:rFonts w:ascii="Cambria Math" w:hAnsi="Cambria Math"/>
-          </w:rPr>
-          <m:t>ρ</m:t>
-        </m:r>
-        <m:r>
-          <m:rPr>
-            <m:sty m:val="p"/>
-          </m:rPr>
-          <w:rPr>
-            <w:rFonts w:ascii="Cambria Math" w:hAnsi="Cambria Math"/>
-          </w:rPr>
-          <m:t>=</m:t>
-        </m:r>
-        <m:r>
-          <w:rPr>
-            <w:rFonts w:ascii="Cambria Math" w:hAnsi="Cambria Math"/>
-          </w:rPr>
-          <m:t>0.70</m:t>
-        </m:r>
-      </m:oMath>
-      <w:r>
-        <w:t xml:space="preserve"> (strong correlation)</w:t>
-      </w:r>
-    </w:p>
-    <w:p>
-      <w:pPr>
-        <w:pStyle w:val="FirstParagraph"/>
-      </w:pPr>
-      <w:r>
-        <w:t>Two sample sizes will be evaluated: (N = 250) and (N = 500), resulting in a total of six simulation scenarios formed by the combination of sample size and correlation level.</w:t>
-      </w:r>
-    </w:p>
-    <w:p>
-      <w:pPr>
-        <w:pStyle w:val="BodyText"/>
-      </w:pPr>
-      <w:r>
-        <w:t xml:space="preserve">Each simulation scenario will be replicated </w:t>
-      </w:r>
-      <w:r>
-        <w:t>many</w:t>
-      </w:r>
-      <w:r>
-        <w:t xml:space="preserve"> times (e.g., 1</w:t>
-      </w:r>
-      <w:r>
-        <w:t>0</w:t>
-      </w:r>
-      <w:r>
-        <w:t>,000 iterations) to ensure stable estimation of performance measures.</w:t>
+      <w:r>
+        <w:t xml:space="preserve">Data will be generated using the </w:t>
+      </w:r>
+      <w:proofErr w:type="spellStart"/>
+      <w:r>
+        <w:t>hdrm</w:t>
+      </w:r>
+      <w:proofErr w:type="spellEnd"/>
+      <w:r>
+        <w:t xml:space="preserve"> package (Breheny, 2025) under the model Y = Xβ + ε, where X is an N</w:t>
+      </w:r>
+      <w:r>
+        <w:t>x</w:t>
+      </w:r>
+      <w:r>
+        <w:t>20 matrix and ε ~ N(0, σ²). Five predictors are truly associated, with coefficients β = (0.5/3, 1/3, 1.5/3, 2/3, 2.5/3)</w:t>
+      </w:r>
+      <w:r>
+        <w:t>, while</w:t>
+      </w:r>
+      <w:r>
+        <w:t xml:space="preserve"> the remaining 15 are null. An exchangeable correlation structure </w:t>
+      </w:r>
+      <w:r>
+        <w:t>will be imposed</w:t>
+      </w:r>
+      <w:r>
+        <w:t xml:space="preserve"> at ρ </w:t>
+      </w:r>
+      <w:r>
+        <w:rPr>
+          <w:rFonts w:ascii="Cambria Math" w:hAnsi="Cambria Math" w:cs="Cambria Math"/>
+        </w:rPr>
+        <w:t>∈</w:t>
+      </w:r>
+      <w:r>
+        <w:t xml:space="preserve"> {0, 0.35, 0.70}, crossed with sample sizes N </w:t>
+      </w:r>
+      <w:r>
+        <w:rPr>
+          <w:rFonts w:ascii="Cambria Math" w:hAnsi="Cambria Math" w:cs="Cambria Math"/>
+        </w:rPr>
+        <w:t>∈</w:t>
+      </w:r>
+      <w:r>
+        <w:t xml:space="preserve"> {250, 500}, yielding six scenarios each replicated 10,000 times.</w:t>
       </w:r>
     </w:p>
     <w:p>
@@ -1478,7 +836,14 @@
           <w:sz w:val="26"/>
           <w:szCs w:val="26"/>
         </w:rPr>
-        <w:t xml:space="preserve">Model Fitting </w:t>
+        <w:t>Variable Selection</w:t>
+      </w:r>
+      <w:r>
+        <w:rPr>
+          <w:sz w:val="26"/>
+          <w:szCs w:val="26"/>
+        </w:rPr>
+        <w:t xml:space="preserve"> </w:t>
       </w:r>
       <w:r>
         <w:rPr>
@@ -1490,87 +855,59 @@
     </w:p>
     <w:p>
       <w:r>
-        <w:t>For each simulated dataset, all 20 predictors will initially be included in the full model. Variable selection will be conducted using backward selection procedures based on different selection criteria and penalized regression methods.</w:t>
-      </w:r>
-    </w:p>
-    <w:p>
-      <w:r>
-        <w:t>First, backward selection will be implemented using several criteria. In each case, the procedure will begin with the full model and sequentially remove predictors until a stopping rule is satisfied. Specifically:</w:t>
-      </w:r>
-    </w:p>
-    <w:p>
-      <w:pPr>
-        <w:numPr>
-          <w:ilvl w:val="0"/>
-          <w:numId w:val="9"/>
-        </w:numPr>
-      </w:pPr>
-      <w:r>
-        <w:t xml:space="preserve">Backward selection based on hypothesis testing will be performed using F-tests and corresponding p-values. At each step, the predictor with the largest p-value will be removed if it exceeds a predefined significance threshold (e.g., </w:t>
-      </w:r>
-      <m:oMath>
-        <m:r>
-          <w:rPr>
-            <w:rFonts w:ascii="Cambria Math" w:hAnsi="Cambria Math"/>
-          </w:rPr>
-          <m:t>α</m:t>
-        </m:r>
-      </m:oMath>
+        <w:t xml:space="preserve">All 20 predictors </w:t>
+      </w:r>
+      <w:r>
+        <w:t xml:space="preserve">will initially be included in a full model. </w:t>
+      </w:r>
+      <w:r>
+        <w:t>Two types of variables selection methods will be reviewed. The first is b</w:t>
+      </w:r>
+      <w:r>
+        <w:t>ackward selection</w:t>
+      </w:r>
+      <w:r>
+        <w:t>, where it</w:t>
+      </w:r>
+      <w:r>
+        <w:t xml:space="preserve"> iteratively remov</w:t>
+      </w:r>
+      <w:r>
+        <w:t>es</w:t>
+      </w:r>
       <w:r>
         <w:t xml:space="preserve"> </w:t>
       </w:r>
       <w:r>
-        <w:t>= 0.15).</w:t>
-      </w:r>
-    </w:p>
-    <w:p>
-      <w:pPr>
-        <w:numPr>
-          <w:ilvl w:val="0"/>
-          <w:numId w:val="9"/>
-        </w:numPr>
-      </w:pPr>
-      <w:r>
-        <w:t xml:space="preserve">Backward selection based on </w:t>
-      </w:r>
-      <w:r>
-        <w:t>AIC</w:t>
-      </w:r>
-      <w:r>
-        <w:t xml:space="preserve"> will be conducted by selecting the model that minimizes the AIC across candidate models visited during the backward elimination process.</w:t>
-      </w:r>
-    </w:p>
-    <w:p>
-      <w:pPr>
-        <w:numPr>
-          <w:ilvl w:val="0"/>
-          <w:numId w:val="9"/>
-        </w:numPr>
-      </w:pPr>
-      <w:r>
-        <w:t xml:space="preserve">Backward selection based on </w:t>
-      </w:r>
-      <w:r>
-        <w:t>BIC</w:t>
-      </w:r>
-      <w:r>
-        <w:t xml:space="preserve"> will be similarly implemented, selecting the model that minimizes the BIC. Because BIC imposes a stronger penalty on model complexity, it is expected to yield more parsimonious models compared to AIC.</w:t>
-      </w:r>
-    </w:p>
-    <w:p>
-      <w:r>
-        <w:t>In addition to backward selection methods, penalized regression approaches will be applied:</w:t>
-      </w:r>
-    </w:p>
-    <w:p>
-      <w:pPr>
-        <w:numPr>
-          <w:ilvl w:val="0"/>
-          <w:numId w:val="10"/>
-        </w:numPr>
-      </w:pPr>
-      <w:r>
-        <w:t xml:space="preserve">Lasso regression will be implemented using an </w:t>
+        <w:t xml:space="preserve">a variable by </w:t>
+      </w:r>
+      <w:r>
+        <w:t>largest p-value (α = 0.1</w:t>
+      </w:r>
+      <w:r>
+        <w:t>0</w:t>
+      </w:r>
+      <w:r>
+        <w:t xml:space="preserve">), </w:t>
+      </w:r>
+      <w:r>
+        <w:t>or by minimizing</w:t>
+      </w:r>
+      <w:r>
+        <w:t xml:space="preserve"> AIC or BIC. </w:t>
+      </w:r>
+      <w:r>
+        <w:t xml:space="preserve"> </w:t>
+      </w:r>
+      <w:r>
+        <w:t xml:space="preserve">The second method is penalized regression methods. These include LASSO, which can shrink coefficients exactly </w:t>
+      </w:r>
+      <w:r>
+        <w:lastRenderedPageBreak/>
+        <w:t>to zero</w:t>
+      </w:r>
+      <w:r>
+        <w:t xml:space="preserve"> using </w:t>
       </w:r>
       <m:oMath>
         <m:sSub>
@@ -1603,19 +940,10 @@
         <w:t xml:space="preserve"> </w:t>
       </w:r>
       <w:r>
-        <w:t>penalty on the regression coefficients. This approach performs variable selection by shrinking some coefficients exactly to zero.</w:t>
-      </w:r>
-    </w:p>
-    <w:p>
-      <w:pPr>
-        <w:numPr>
-          <w:ilvl w:val="0"/>
-          <w:numId w:val="10"/>
-        </w:numPr>
-      </w:pPr>
-      <w:r>
-        <w:lastRenderedPageBreak/>
-        <w:t xml:space="preserve">Elastic net regression will be implemented using a combination of </w:t>
+        <w:t xml:space="preserve"> penalty </w:t>
+      </w:r>
+      <w:r>
+        <w:t xml:space="preserve">and elastic net, which combines </w:t>
       </w:r>
       <m:oMath>
         <m:sSub>
@@ -1645,6 +973,9 @@
         </m:sSub>
       </m:oMath>
       <w:r>
+        <w:t xml:space="preserve"> </w:t>
+      </w:r>
+      <w:r>
         <w:t xml:space="preserve"> and </w:t>
       </w:r>
       <m:oMath>
@@ -1675,26 +1006,39 @@
         </m:sSub>
       </m:oMath>
       <w:r>
-        <w:t xml:space="preserve"> penalties. This method is particularly well-suited for settings with correlated predictors, as it encourages the selection of groups of related variables.</w:t>
+        <w:t xml:space="preserve"> </w:t>
+      </w:r>
+      <w:r>
+        <w:t xml:space="preserve">penalties and is </w:t>
+      </w:r>
+      <w:r>
+        <w:t>said to be</w:t>
+      </w:r>
+      <w:r>
+        <w:t xml:space="preserve"> </w:t>
+      </w:r>
+      <w:r>
+        <w:t xml:space="preserve">more </w:t>
+      </w:r>
+      <w:r>
+        <w:t xml:space="preserve">useful when predictors are </w:t>
+      </w:r>
+      <w:r>
+        <w:t xml:space="preserve">strongly </w:t>
+      </w:r>
+      <w:r>
+        <w:t>correlated.</w:t>
       </w:r>
     </w:p>
     <w:p>
       <w:r>
-        <w:t>For both lasso and elastic net, the regularization parameter (</w:t>
-      </w:r>
-      <m:oMath>
-        <m:r>
-          <w:rPr>
-            <w:rFonts w:ascii="Cambria Math" w:hAnsi="Cambria Math"/>
-          </w:rPr>
-          <m:t>λ</m:t>
-        </m:r>
-      </m:oMath>
-      <w:r>
-        <w:t xml:space="preserve">) will be selected using k-fold cross-validation. </w:t>
-      </w:r>
-      <w:r>
-        <w:t xml:space="preserve">Two lambda selection criteria will be examined: </w:t>
+        <w:t>For both LASSO and elastic net, the tuning parameter lambda will be selected by using 10-fold cross-validation, and two lambdas</w:t>
+      </w:r>
+      <w:r>
+        <w:t xml:space="preserve"> will be investigated</w:t>
+      </w:r>
+      <w:r>
+        <w:t>, one that minimizes CV prediction error</w:t>
       </w:r>
       <w:r>
         <w:t xml:space="preserve"> </w:t>
@@ -1733,25 +1077,13 @@
         </m:sSub>
       </m:oMath>
       <w:r>
-        <w:rPr>
-          <w:rFonts w:eastAsiaTheme="minorEastAsia"/>
-        </w:rPr>
-        <w:t>), which minimizes cross-validation prediction error</w:t>
-      </w:r>
-      <w:r>
-        <w:rPr>
-          <w:rFonts w:eastAsiaTheme="minorEastAsia"/>
-        </w:rPr>
-        <w:t>,</w:t>
-      </w:r>
-      <w:r>
-        <w:rPr>
-          <w:rFonts w:eastAsiaTheme="minorEastAsia"/>
-        </w:rPr>
-        <w:t xml:space="preserve"> and </w:t>
-      </w:r>
-      <w:r>
-        <w:t>(</w:t>
+        <w:t>)</w:t>
+      </w:r>
+      <w:r>
+        <w:t xml:space="preserve"> and a more conservative choice within 1 SE of that minimum</w:t>
+      </w:r>
+      <w:r>
+        <w:t xml:space="preserve"> (</w:t>
       </w:r>
       <m:oMath>
         <m:sSub>
@@ -1784,106 +1116,7 @@
         <w:t>)</w:t>
       </w:r>
       <w:r>
-        <w:t>, which is the largest value within one standard error of the minimum.</w:t>
-      </w:r>
-    </w:p>
-    <w:p>
-      <w:r>
-        <w:t xml:space="preserve">Two commonly used selection rules will be evaluated: the value of </w:t>
-      </w:r>
-      <m:oMath>
-        <m:r>
-          <w:rPr>
-            <w:rFonts w:ascii="Cambria Math" w:hAnsi="Cambria Math"/>
-          </w:rPr>
-          <m:t>λ</m:t>
-        </m:r>
-      </m:oMath>
-      <w:r>
-        <w:t xml:space="preserve"> that minimizes cross-validated prediction error (</w:t>
-      </w:r>
-      <m:oMath>
-        <m:sSub>
-          <m:sSubPr>
-            <m:ctrlPr>
-              <w:rPr>
-                <w:rFonts w:ascii="Cambria Math" w:hAnsi="Cambria Math"/>
-              </w:rPr>
-            </m:ctrlPr>
-          </m:sSubPr>
-          <m:e>
-            <m:r>
-              <w:rPr>
-                <w:rFonts w:ascii="Cambria Math" w:hAnsi="Cambria Math"/>
-              </w:rPr>
-              <m:t>λ</m:t>
-            </m:r>
-          </m:e>
-          <m:sub>
-            <m:r>
-              <w:rPr>
-                <w:rFonts w:ascii="Cambria Math" w:hAnsi="Cambria Math"/>
-              </w:rPr>
-              <m:t>min</m:t>
-            </m:r>
-          </m:sub>
-        </m:sSub>
-      </m:oMath>
-      <w:r>
-        <w:rPr>
-          <w:rFonts w:eastAsiaTheme="minorEastAsia"/>
-        </w:rPr>
-        <w:t xml:space="preserve">) </w:t>
-      </w:r>
-      <w:r>
-        <w:t xml:space="preserve">and the largest value within one standard error of the minimum </w:t>
-      </w:r>
-      <w:r>
-        <w:t>(</w:t>
-      </w:r>
-      <m:oMath>
-        <m:sSub>
-          <m:sSubPr>
-            <m:ctrlPr>
-              <w:rPr>
-                <w:rFonts w:ascii="Cambria Math" w:hAnsi="Cambria Math"/>
-              </w:rPr>
-            </m:ctrlPr>
-          </m:sSubPr>
-          <m:e>
-            <m:r>
-              <w:rPr>
-                <w:rFonts w:ascii="Cambria Math" w:hAnsi="Cambria Math"/>
-              </w:rPr>
-              <m:t>λ</m:t>
-            </m:r>
-          </m:e>
-          <m:sub>
-            <m:r>
-              <w:rPr>
-                <w:rFonts w:ascii="Cambria Math" w:hAnsi="Cambria Math"/>
-              </w:rPr>
-              <m:t>1se</m:t>
-            </m:r>
-          </m:sub>
-        </m:sSub>
-      </m:oMath>
-      <w:r>
-        <w:t xml:space="preserve">). For the elastic net, the mixing parameter will be fixed at a predetermined value (e.g., </w:t>
-      </w:r>
-      <m:oMath>
-        <m:r>
-          <w:rPr>
-            <w:rFonts w:ascii="Cambria Math" w:hAnsi="Cambria Math"/>
-          </w:rPr>
-          <m:t>α</m:t>
-        </m:r>
-      </m:oMath>
-      <w:r>
-        <w:t xml:space="preserve"> </w:t>
-      </w:r>
-      <w:r>
-        <w:t>= 0.5).</w:t>
+        <w:t>.</w:t>
       </w:r>
     </w:p>
     <w:p>
@@ -1906,7 +1139,7 @@
           <w:sz w:val="26"/>
           <w:szCs w:val="26"/>
         </w:rPr>
-        <w:t>3</w:t>
+        <w:t>4</w:t>
       </w:r>
       <w:r>
         <w:rPr>
@@ -1920,366 +1153,125 @@
           <w:sz w:val="26"/>
           <w:szCs w:val="26"/>
         </w:rPr>
-        <w:t>Estimands</w:t>
-      </w:r>
-      <w:r>
-        <w:rPr>
-          <w:sz w:val="26"/>
-          <w:szCs w:val="26"/>
-        </w:rPr>
-        <w:t xml:space="preserve"> &amp; Targets</w:t>
+        <w:t>Performance Measures</w:t>
       </w:r>
     </w:p>
     <w:p>
-      <w:pPr>
-        <w:pStyle w:val="FirstParagraph"/>
-      </w:pPr>
-      <w:r>
-        <w:t xml:space="preserve">The primary </w:t>
-      </w:r>
-      <w:r>
-        <w:t>estimands and</w:t>
-      </w:r>
-      <w:r>
-        <w:t xml:space="preserve"> targets </w:t>
-      </w:r>
-      <w:r>
-        <w:t>of interest in this simulation study include:</w:t>
+      <w:bookmarkStart w:id="11" w:name="_Toc221895317"/>
+      <w:bookmarkStart w:id="12" w:name="_Toc221895382"/>
+      <w:r>
+        <w:t xml:space="preserve">Methods </w:t>
+      </w:r>
+      <w:r>
+        <w:t>will be</w:t>
+      </w:r>
+      <w:r>
+        <w:t xml:space="preserve"> evaluated on true and false positive rates, sensitivity, specificity, and confusion matrices. For retained true predictors, bias, 95% CI coverage, and type I/II error rates are reported. </w:t>
+      </w:r>
+      <w:r>
+        <w:t xml:space="preserve">Coverage of 95% </w:t>
+      </w:r>
+      <w:r>
+        <w:t>CIs</w:t>
+      </w:r>
+      <w:r>
+        <w:t xml:space="preserve"> will be evaluated across all variables</w:t>
+      </w:r>
+      <w:r>
+        <w:t xml:space="preserve"> (20)</w:t>
+      </w:r>
+      <w:r>
+        <w:t xml:space="preserve">. For selected variables, coverage is determined by whether the </w:t>
+      </w:r>
+      <w:r>
+        <w:t>CI</w:t>
+      </w:r>
+      <w:r>
+        <w:t xml:space="preserve"> contains the true parameter. For non-selected variables, coefficients are treated as zero</w:t>
+      </w:r>
+      <w:r>
+        <w:t xml:space="preserve"> and f</w:t>
+      </w:r>
+      <w:r>
+        <w:t>ailure to select a true predictor is counted as non-coverage</w:t>
+      </w:r>
+      <w:r>
+        <w:t>. C</w:t>
+      </w:r>
+      <w:r>
+        <w:t>orrectly excluding null predictors is considered coverage.</w:t>
+      </w:r>
+      <w:r>
+        <w:t xml:space="preserve"> </w:t>
+      </w:r>
+      <w:r>
+        <w:t xml:space="preserve">Monte Carlo standard errors </w:t>
+      </w:r>
+      <w:r>
+        <w:t>will be</w:t>
+      </w:r>
+      <w:r>
+        <w:t xml:space="preserve"> computed for all metrics.</w:t>
       </w:r>
     </w:p>
     <w:p>
       <w:pPr>
-        <w:pStyle w:val="Compact"/>
-        <w:numPr>
-          <w:ilvl w:val="0"/>
-          <w:numId w:val="6"/>
-        </w:numPr>
-      </w:pPr>
-      <w:r>
-        <w:t>The true positive and false positive rates</w:t>
-      </w:r>
-      <w:r>
-        <w:t xml:space="preserve"> (target)</w:t>
-      </w:r>
-    </w:p>
-    <w:p>
-      <w:pPr>
-        <w:pStyle w:val="Compact"/>
-        <w:numPr>
-          <w:ilvl w:val="0"/>
-          <w:numId w:val="6"/>
-        </w:numPr>
-      </w:pPr>
-      <w:r>
-        <w:t>The regression coefficients for selected variables</w:t>
-      </w:r>
-      <w:r>
-        <w:t xml:space="preserve"> (estimand)</w:t>
-      </w:r>
-    </w:p>
-    <w:p>
-      <w:pPr>
-        <w:pStyle w:val="Compact"/>
-        <w:numPr>
-          <w:ilvl w:val="0"/>
-          <w:numId w:val="6"/>
-        </w:numPr>
-      </w:pPr>
-      <w:r>
-        <w:t>The coverage probability of nominal 95% confidence intervals</w:t>
-      </w:r>
-      <w:r>
-        <w:t xml:space="preserve"> (</w:t>
-      </w:r>
-      <w:r>
-        <w:t>estimand</w:t>
-      </w:r>
-      <w:r>
-        <w:t>)</w:t>
-      </w:r>
-    </w:p>
-    <w:p>
-      <w:pPr>
-        <w:pStyle w:val="Compact"/>
-        <w:numPr>
-          <w:ilvl w:val="0"/>
-          <w:numId w:val="6"/>
-        </w:numPr>
-      </w:pPr>
-      <w:r>
-        <w:t>Type I and type II error rates for hypothesis testing</w:t>
-      </w:r>
-      <w:r>
-        <w:t xml:space="preserve"> (target)</w:t>
-      </w:r>
-    </w:p>
-    <w:p>
-      <w:pPr>
-        <w:pStyle w:val="Compact"/>
-        <w:ind w:left="720"/>
-      </w:pPr>
-    </w:p>
-    <w:p>
-      <w:pPr>
-        <w:pStyle w:val="Heading4"/>
-        <w:rPr>
-          <w:sz w:val="26"/>
-          <w:szCs w:val="26"/>
-        </w:rPr>
-      </w:pPr>
-      <w:r>
-        <w:rPr>
-          <w:sz w:val="26"/>
-          <w:szCs w:val="26"/>
-        </w:rPr>
-        <w:t>2.</w:t>
-      </w:r>
-      <w:r>
-        <w:rPr>
-          <w:sz w:val="26"/>
-          <w:szCs w:val="26"/>
-        </w:rPr>
-        <w:t>4</w:t>
-      </w:r>
-      <w:r>
-        <w:rPr>
-          <w:sz w:val="26"/>
-          <w:szCs w:val="26"/>
-        </w:rPr>
-        <w:t xml:space="preserve"> </w:t>
-      </w:r>
-      <w:r>
-        <w:rPr>
-          <w:sz w:val="26"/>
-          <w:szCs w:val="26"/>
-        </w:rPr>
-        <w:t>Performance Measures</w:t>
-      </w:r>
-    </w:p>
-    <w:p>
-      <w:bookmarkStart w:id="10" w:name="_Toc221895317"/>
-      <w:bookmarkStart w:id="11" w:name="_Toc221895382"/>
-      <w:bookmarkStart w:id="12" w:name="_Toc228353113"/>
-      <w:r>
-        <w:t>Variable selection performance will be assessed across several metrics. The true positive and false positive rates, along with sensitivity, specificity, and confusion matrix summaries, will be evaluated to determine how often the final model includes the five variables known to have an association and how often it includes the 15 that are not associated with the outcome. For variables retained in the final model with known associations, bias of regression coefficient estimates, coverage probability of 95% confidence intervals</w:t>
-      </w:r>
-      <w:r>
-        <w:t xml:space="preserve"> (CI)</w:t>
-      </w:r>
-      <w:r>
-        <w:t xml:space="preserve">, and type I and type II error rates will be evaluated. </w:t>
-      </w:r>
-    </w:p>
-    <w:p>
-      <w:r>
-        <w:t xml:space="preserve">Coverage of 95% </w:t>
-      </w:r>
-      <w:r>
-        <w:t>CIs</w:t>
-      </w:r>
-      <w:r>
-        <w:t xml:space="preserve"> will be evaluated across all variables</w:t>
-      </w:r>
-      <w:r>
-        <w:t xml:space="preserve"> (20)</w:t>
-      </w:r>
-      <w:r>
-        <w:t xml:space="preserve">. For selected variables, coverage is determined by whether the </w:t>
-      </w:r>
-      <w:r>
-        <w:t>CI</w:t>
-      </w:r>
-      <w:r>
-        <w:t xml:space="preserve"> contains the true parameter. For non-selected variables, coefficients are treated as zero</w:t>
-      </w:r>
-      <w:r>
-        <w:t xml:space="preserve"> and f</w:t>
-      </w:r>
-      <w:r>
-        <w:t>ailure to select a true predictor is counted as non-coverage</w:t>
-      </w:r>
-      <w:r>
-        <w:t>. C</w:t>
-      </w:r>
-      <w:r>
-        <w:t>orrectly excluding null predictors is considered coverage.</w:t>
-      </w:r>
-    </w:p>
-    <w:p>
-      <w:pPr>
-        <w:rPr>
-          <w:rFonts w:eastAsiaTheme="minorEastAsia"/>
-          <w:kern w:val="0"/>
-          <w:lang w:eastAsia="zh-CN"/>
-          <w14:ligatures w14:val="none"/>
-        </w:rPr>
-      </w:pPr>
-      <w:r>
-        <w:rPr>
-          <w:rFonts w:eastAsiaTheme="minorEastAsia"/>
-          <w:kern w:val="0"/>
-          <w:lang w:eastAsia="zh-CN"/>
-          <w14:ligatures w14:val="none"/>
-        </w:rPr>
-        <w:t>Finally, Monte Carlo standard errors will be computed for all performance measures to quantify the uncertainty arising from the finite number of simulation repetitions.</w:t>
-      </w:r>
-    </w:p>
-    <w:p>
-      <w:pPr>
         <w:pStyle w:val="Heading2"/>
       </w:pPr>
-      <w:r>
-        <w:lastRenderedPageBreak/>
+      <w:bookmarkStart w:id="13" w:name="_Toc228694930"/>
+      <w:r>
         <w:t xml:space="preserve">3. </w:t>
       </w:r>
-      <w:bookmarkEnd w:id="10"/>
       <w:bookmarkEnd w:id="11"/>
+      <w:bookmarkEnd w:id="12"/>
       <w:r>
         <w:t xml:space="preserve">Analysis </w:t>
       </w:r>
-      <w:bookmarkEnd w:id="12"/>
-    </w:p>
-    <w:p>
-      <w:pPr>
-        <w:pStyle w:val="FirstParagraph"/>
-      </w:pPr>
-      <w:r>
-        <w:t>For each simulation scenario, the following steps will be performed:</w:t>
-      </w:r>
-    </w:p>
-    <w:p>
-      <w:pPr>
-        <w:pStyle w:val="Compact"/>
-        <w:numPr>
-          <w:ilvl w:val="0"/>
-          <w:numId w:val="8"/>
-        </w:numPr>
-      </w:pPr>
-      <w:r>
-        <w:t xml:space="preserve">Generate a dataset </w:t>
-      </w:r>
-      <w:r>
-        <w:t>according to the specified</w:t>
-      </w:r>
-      <w:r>
-        <w:t xml:space="preserve"> data-generating mechanism</w:t>
-      </w:r>
-    </w:p>
-    <w:p>
-      <w:pPr>
-        <w:pStyle w:val="Compact"/>
-        <w:numPr>
-          <w:ilvl w:val="0"/>
-          <w:numId w:val="8"/>
-        </w:numPr>
-      </w:pPr>
-      <w:r>
-        <w:t>Apply each variable selection method</w:t>
-      </w:r>
-    </w:p>
-    <w:p>
-      <w:pPr>
-        <w:pStyle w:val="Compact"/>
-        <w:numPr>
-          <w:ilvl w:val="0"/>
-          <w:numId w:val="8"/>
-        </w:numPr>
-      </w:pPr>
-      <w:r>
-        <w:t>Record selected variables, estimated coefficients, and inferential statistics</w:t>
-      </w:r>
-    </w:p>
-    <w:p>
-      <w:pPr>
-        <w:pStyle w:val="Compact"/>
-        <w:numPr>
-          <w:ilvl w:val="0"/>
-          <w:numId w:val="8"/>
-        </w:numPr>
-      </w:pPr>
-      <w:r>
-        <w:t>Repeat the process across all simulation iterations</w:t>
-      </w:r>
-    </w:p>
-    <w:p>
-      <w:pPr>
-        <w:pStyle w:val="FirstParagraph"/>
-      </w:pPr>
-      <w:r>
-        <w:t>After all simulations are completed, performance measures will be summarized across repetitions. Results will be compared across methods, sample sizes, and correlation structures.</w:t>
-      </w:r>
-    </w:p>
-    <w:p>
-      <w:pPr>
-        <w:pStyle w:val="Heading2"/>
-      </w:pPr>
-      <w:bookmarkStart w:id="13" w:name="_Toc228353114"/>
-      <w:r>
-        <w:t xml:space="preserve">4. </w:t>
-      </w:r>
-      <w:r>
-        <w:t>Reporting</w:t>
-      </w:r>
-      <w:r>
-        <w:t xml:space="preserve"> Results</w:t>
+      <w:r>
+        <w:t>&amp; Reporting</w:t>
       </w:r>
       <w:bookmarkEnd w:id="13"/>
     </w:p>
     <w:p>
       <w:r>
-        <w:t>Results will be presented using a combination of tables and graphical summaries. Tables will report performance metrics for each method across all simulation scenarios.</w:t>
-      </w:r>
-      <w:r>
-        <w:t xml:space="preserve"> </w:t>
-      </w:r>
-      <w:r>
-        <w:t>Graphical displays may include plots of selection probabilities, false positive rates, and bias across varying conditions</w:t>
-      </w:r>
-      <w:r>
-        <w:t xml:space="preserve">. </w:t>
-      </w:r>
-      <w:r>
-        <w:t xml:space="preserve">Comparisons between methods will focus on trade-offs between variable selection accuracy, estimation bias, and </w:t>
-      </w:r>
-      <w:r>
-        <w:t>control of type I and type II error rates</w:t>
-      </w:r>
-      <w:r>
-        <w:t>.</w:t>
-      </w:r>
-    </w:p>
-    <w:p/>
-    <w:p>
-      <w:pPr>
-        <w:rPr>
-          <w:color w:val="000000" w:themeColor="text1"/>
-        </w:rPr>
-      </w:pPr>
+        <w:t xml:space="preserve">Each </w:t>
+      </w:r>
+      <w:r>
+        <w:t xml:space="preserve">of the six </w:t>
+      </w:r>
+      <w:r>
+        <w:t>scenario</w:t>
+      </w:r>
+      <w:r>
+        <w:t>s generates a dataset</w:t>
+      </w:r>
+      <w:r>
+        <w:t xml:space="preserve">, </w:t>
+      </w:r>
+      <w:r>
+        <w:t>applies a selection method</w:t>
+      </w:r>
+      <w:r>
+        <w:t xml:space="preserve">, and </w:t>
+      </w:r>
+      <w:r>
+        <w:t xml:space="preserve">records the </w:t>
+      </w:r>
+      <w:r>
+        <w:t xml:space="preserve">selected variables, estimates, and inferential statistics. Results </w:t>
+      </w:r>
+      <w:r>
+        <w:t>will be</w:t>
+      </w:r>
+      <w:r>
+        <w:t xml:space="preserve"> summarized in tables and plots comparing selection accuracy, bias, and error rates across methods, sample sizes, and correlation levels.</w:t>
+      </w:r>
     </w:p>
     <w:p>
       <w:pPr>
-        <w:jc w:val="center"/>
-        <w:rPr>
-          <w:color w:val="000000" w:themeColor="text1"/>
-        </w:rPr>
-      </w:pPr>
-    </w:p>
-    <w:p>
-      <w:pPr>
-        <w:jc w:val="center"/>
-      </w:pPr>
-    </w:p>
-    <w:p>
-      <w:pPr>
-        <w:jc w:val="center"/>
-      </w:pPr>
-    </w:p>
-    <w:p/>
-    <w:p>
-      <w:pPr>
         <w:pStyle w:val="Heading2"/>
       </w:pPr>
-      <w:bookmarkStart w:id="14" w:name="_Toc228353115"/>
+      <w:bookmarkStart w:id="14" w:name="_Toc228694931"/>
       <w:r>
         <w:t>References</w:t>
       </w:r>
@@ -2329,12 +1321,21 @@
       <w:r>
         <w:t xml:space="preserve">Breheny, P. (2025). </w:t>
       </w:r>
+      <w:proofErr w:type="spellStart"/>
       <w:r>
         <w:rPr>
           <w:i/>
           <w:iCs/>
         </w:rPr>
-        <w:t>hdrm: High-dimensional regression modeling</w:t>
+        <w:t>hdrm</w:t>
+      </w:r>
+      <w:proofErr w:type="spellEnd"/>
+      <w:r>
+        <w:rPr>
+          <w:i/>
+          <w:iCs/>
+        </w:rPr>
+        <w:t>: High-dimensional regression modeling</w:t>
       </w:r>
       <w:r>
         <w:t xml:space="preserve"> (Version 0.17.1) [R package]. GitHub. https://github.com/pbreheny/hdrm</w:t>
@@ -3338,6 +2339,155 @@
     </w:lvl>
   </w:abstractNum>
   <w:abstractNum w:abstractNumId="8" w15:restartNumberingAfterBreak="0">
+    <w:nsid w:val="4BEC6C6E"/>
+    <w:multiLevelType w:val="multilevel"/>
+    <w:tmpl w:val="3258E3DE"/>
+    <w:lvl w:ilvl="0">
+      <w:start w:val="1"/>
+      <w:numFmt w:val="bullet"/>
+      <w:lvlText w:val=""/>
+      <w:lvlJc w:val="left"/>
+      <w:pPr>
+        <w:tabs>
+          <w:tab w:val="num" w:pos="720"/>
+        </w:tabs>
+        <w:ind w:left="720" w:hanging="360"/>
+      </w:pPr>
+      <w:rPr>
+        <w:rFonts w:ascii="Symbol" w:hAnsi="Symbol" w:hint="default"/>
+        <w:sz w:val="20"/>
+      </w:rPr>
+    </w:lvl>
+    <w:lvl w:ilvl="1" w:tentative="1">
+      <w:start w:val="1"/>
+      <w:numFmt w:val="bullet"/>
+      <w:lvlText w:val="o"/>
+      <w:lvlJc w:val="left"/>
+      <w:pPr>
+        <w:tabs>
+          <w:tab w:val="num" w:pos="1440"/>
+        </w:tabs>
+        <w:ind w:left="1440" w:hanging="360"/>
+      </w:pPr>
+      <w:rPr>
+        <w:rFonts w:ascii="Courier New" w:hAnsi="Courier New" w:hint="default"/>
+        <w:sz w:val="20"/>
+      </w:rPr>
+    </w:lvl>
+    <w:lvl w:ilvl="2" w:tentative="1">
+      <w:start w:val="1"/>
+      <w:numFmt w:val="bullet"/>
+      <w:lvlText w:val=""/>
+      <w:lvlJc w:val="left"/>
+      <w:pPr>
+        <w:tabs>
+          <w:tab w:val="num" w:pos="2160"/>
+        </w:tabs>
+        <w:ind w:left="2160" w:hanging="360"/>
+      </w:pPr>
+      <w:rPr>
+        <w:rFonts w:ascii="Wingdings" w:hAnsi="Wingdings" w:hint="default"/>
+        <w:sz w:val="20"/>
+      </w:rPr>
+    </w:lvl>
+    <w:lvl w:ilvl="3" w:tentative="1">
+      <w:start w:val="1"/>
+      <w:numFmt w:val="bullet"/>
+      <w:lvlText w:val=""/>
+      <w:lvlJc w:val="left"/>
+      <w:pPr>
+        <w:tabs>
+          <w:tab w:val="num" w:pos="2880"/>
+        </w:tabs>
+        <w:ind w:left="2880" w:hanging="360"/>
+      </w:pPr>
+      <w:rPr>
+        <w:rFonts w:ascii="Wingdings" w:hAnsi="Wingdings" w:hint="default"/>
+        <w:sz w:val="20"/>
+      </w:rPr>
+    </w:lvl>
+    <w:lvl w:ilvl="4" w:tentative="1">
+      <w:start w:val="1"/>
+      <w:numFmt w:val="bullet"/>
+      <w:lvlText w:val=""/>
+      <w:lvlJc w:val="left"/>
+      <w:pPr>
+        <w:tabs>
+          <w:tab w:val="num" w:pos="3600"/>
+        </w:tabs>
+        <w:ind w:left="3600" w:hanging="360"/>
+      </w:pPr>
+      <w:rPr>
+        <w:rFonts w:ascii="Wingdings" w:hAnsi="Wingdings" w:hint="default"/>
+        <w:sz w:val="20"/>
+      </w:rPr>
+    </w:lvl>
+    <w:lvl w:ilvl="5" w:tentative="1">
+      <w:start w:val="1"/>
+      <w:numFmt w:val="bullet"/>
+      <w:lvlText w:val=""/>
+      <w:lvlJc w:val="left"/>
+      <w:pPr>
+        <w:tabs>
+          <w:tab w:val="num" w:pos="4320"/>
+        </w:tabs>
+        <w:ind w:left="4320" w:hanging="360"/>
+      </w:pPr>
+      <w:rPr>
+        <w:rFonts w:ascii="Wingdings" w:hAnsi="Wingdings" w:hint="default"/>
+        <w:sz w:val="20"/>
+      </w:rPr>
+    </w:lvl>
+    <w:lvl w:ilvl="6" w:tentative="1">
+      <w:start w:val="1"/>
+      <w:numFmt w:val="bullet"/>
+      <w:lvlText w:val=""/>
+      <w:lvlJc w:val="left"/>
+      <w:pPr>
+        <w:tabs>
+          <w:tab w:val="num" w:pos="5040"/>
+        </w:tabs>
+        <w:ind w:left="5040" w:hanging="360"/>
+      </w:pPr>
+      <w:rPr>
+        <w:rFonts w:ascii="Wingdings" w:hAnsi="Wingdings" w:hint="default"/>
+        <w:sz w:val="20"/>
+      </w:rPr>
+    </w:lvl>
+    <w:lvl w:ilvl="7" w:tentative="1">
+      <w:start w:val="1"/>
+      <w:numFmt w:val="bullet"/>
+      <w:lvlText w:val=""/>
+      <w:lvlJc w:val="left"/>
+      <w:pPr>
+        <w:tabs>
+          <w:tab w:val="num" w:pos="5760"/>
+        </w:tabs>
+        <w:ind w:left="5760" w:hanging="360"/>
+      </w:pPr>
+      <w:rPr>
+        <w:rFonts w:ascii="Wingdings" w:hAnsi="Wingdings" w:hint="default"/>
+        <w:sz w:val="20"/>
+      </w:rPr>
+    </w:lvl>
+    <w:lvl w:ilvl="8" w:tentative="1">
+      <w:start w:val="1"/>
+      <w:numFmt w:val="bullet"/>
+      <w:lvlText w:val=""/>
+      <w:lvlJc w:val="left"/>
+      <w:pPr>
+        <w:tabs>
+          <w:tab w:val="num" w:pos="6480"/>
+        </w:tabs>
+        <w:ind w:left="6480" w:hanging="360"/>
+      </w:pPr>
+      <w:rPr>
+        <w:rFonts w:ascii="Wingdings" w:hAnsi="Wingdings" w:hint="default"/>
+        <w:sz w:val="20"/>
+      </w:rPr>
+    </w:lvl>
+  </w:abstractNum>
+  <w:abstractNum w:abstractNumId="9" w15:restartNumberingAfterBreak="0">
     <w:nsid w:val="59793381"/>
     <w:multiLevelType w:val="multilevel"/>
     <w:tmpl w:val="1B969680"/>
@@ -3486,7 +2636,7 @@
       </w:rPr>
     </w:lvl>
   </w:abstractNum>
-  <w:abstractNum w:abstractNumId="9" w15:restartNumberingAfterBreak="0">
+  <w:abstractNum w:abstractNumId="10" w15:restartNumberingAfterBreak="0">
     <w:nsid w:val="5BF33F4E"/>
     <w:multiLevelType w:val="hybridMultilevel"/>
     <w:tmpl w:val="A8426FE2"/>
@@ -3570,6 +2720,304 @@
       <w:pPr>
         <w:ind w:left="6480" w:hanging="180"/>
       </w:pPr>
+    </w:lvl>
+  </w:abstractNum>
+  <w:abstractNum w:abstractNumId="11" w15:restartNumberingAfterBreak="0">
+    <w:nsid w:val="743B5A93"/>
+    <w:multiLevelType w:val="multilevel"/>
+    <w:tmpl w:val="E17C0FA0"/>
+    <w:lvl w:ilvl="0">
+      <w:start w:val="1"/>
+      <w:numFmt w:val="bullet"/>
+      <w:lvlText w:val=""/>
+      <w:lvlJc w:val="left"/>
+      <w:pPr>
+        <w:tabs>
+          <w:tab w:val="num" w:pos="720"/>
+        </w:tabs>
+        <w:ind w:left="720" w:hanging="360"/>
+      </w:pPr>
+      <w:rPr>
+        <w:rFonts w:ascii="Symbol" w:hAnsi="Symbol" w:hint="default"/>
+        <w:sz w:val="20"/>
+      </w:rPr>
+    </w:lvl>
+    <w:lvl w:ilvl="1" w:tentative="1">
+      <w:start w:val="1"/>
+      <w:numFmt w:val="bullet"/>
+      <w:lvlText w:val="o"/>
+      <w:lvlJc w:val="left"/>
+      <w:pPr>
+        <w:tabs>
+          <w:tab w:val="num" w:pos="1440"/>
+        </w:tabs>
+        <w:ind w:left="1440" w:hanging="360"/>
+      </w:pPr>
+      <w:rPr>
+        <w:rFonts w:ascii="Courier New" w:hAnsi="Courier New" w:hint="default"/>
+        <w:sz w:val="20"/>
+      </w:rPr>
+    </w:lvl>
+    <w:lvl w:ilvl="2" w:tentative="1">
+      <w:start w:val="1"/>
+      <w:numFmt w:val="bullet"/>
+      <w:lvlText w:val=""/>
+      <w:lvlJc w:val="left"/>
+      <w:pPr>
+        <w:tabs>
+          <w:tab w:val="num" w:pos="2160"/>
+        </w:tabs>
+        <w:ind w:left="2160" w:hanging="360"/>
+      </w:pPr>
+      <w:rPr>
+        <w:rFonts w:ascii="Wingdings" w:hAnsi="Wingdings" w:hint="default"/>
+        <w:sz w:val="20"/>
+      </w:rPr>
+    </w:lvl>
+    <w:lvl w:ilvl="3" w:tentative="1">
+      <w:start w:val="1"/>
+      <w:numFmt w:val="bullet"/>
+      <w:lvlText w:val=""/>
+      <w:lvlJc w:val="left"/>
+      <w:pPr>
+        <w:tabs>
+          <w:tab w:val="num" w:pos="2880"/>
+        </w:tabs>
+        <w:ind w:left="2880" w:hanging="360"/>
+      </w:pPr>
+      <w:rPr>
+        <w:rFonts w:ascii="Wingdings" w:hAnsi="Wingdings" w:hint="default"/>
+        <w:sz w:val="20"/>
+      </w:rPr>
+    </w:lvl>
+    <w:lvl w:ilvl="4" w:tentative="1">
+      <w:start w:val="1"/>
+      <w:numFmt w:val="bullet"/>
+      <w:lvlText w:val=""/>
+      <w:lvlJc w:val="left"/>
+      <w:pPr>
+        <w:tabs>
+          <w:tab w:val="num" w:pos="3600"/>
+        </w:tabs>
+        <w:ind w:left="3600" w:hanging="360"/>
+      </w:pPr>
+      <w:rPr>
+        <w:rFonts w:ascii="Wingdings" w:hAnsi="Wingdings" w:hint="default"/>
+        <w:sz w:val="20"/>
+      </w:rPr>
+    </w:lvl>
+    <w:lvl w:ilvl="5" w:tentative="1">
+      <w:start w:val="1"/>
+      <w:numFmt w:val="bullet"/>
+      <w:lvlText w:val=""/>
+      <w:lvlJc w:val="left"/>
+      <w:pPr>
+        <w:tabs>
+          <w:tab w:val="num" w:pos="4320"/>
+        </w:tabs>
+        <w:ind w:left="4320" w:hanging="360"/>
+      </w:pPr>
+      <w:rPr>
+        <w:rFonts w:ascii="Wingdings" w:hAnsi="Wingdings" w:hint="default"/>
+        <w:sz w:val="20"/>
+      </w:rPr>
+    </w:lvl>
+    <w:lvl w:ilvl="6" w:tentative="1">
+      <w:start w:val="1"/>
+      <w:numFmt w:val="bullet"/>
+      <w:lvlText w:val=""/>
+      <w:lvlJc w:val="left"/>
+      <w:pPr>
+        <w:tabs>
+          <w:tab w:val="num" w:pos="5040"/>
+        </w:tabs>
+        <w:ind w:left="5040" w:hanging="360"/>
+      </w:pPr>
+      <w:rPr>
+        <w:rFonts w:ascii="Wingdings" w:hAnsi="Wingdings" w:hint="default"/>
+        <w:sz w:val="20"/>
+      </w:rPr>
+    </w:lvl>
+    <w:lvl w:ilvl="7" w:tentative="1">
+      <w:start w:val="1"/>
+      <w:numFmt w:val="bullet"/>
+      <w:lvlText w:val=""/>
+      <w:lvlJc w:val="left"/>
+      <w:pPr>
+        <w:tabs>
+          <w:tab w:val="num" w:pos="5760"/>
+        </w:tabs>
+        <w:ind w:left="5760" w:hanging="360"/>
+      </w:pPr>
+      <w:rPr>
+        <w:rFonts w:ascii="Wingdings" w:hAnsi="Wingdings" w:hint="default"/>
+        <w:sz w:val="20"/>
+      </w:rPr>
+    </w:lvl>
+    <w:lvl w:ilvl="8" w:tentative="1">
+      <w:start w:val="1"/>
+      <w:numFmt w:val="bullet"/>
+      <w:lvlText w:val=""/>
+      <w:lvlJc w:val="left"/>
+      <w:pPr>
+        <w:tabs>
+          <w:tab w:val="num" w:pos="6480"/>
+        </w:tabs>
+        <w:ind w:left="6480" w:hanging="360"/>
+      </w:pPr>
+      <w:rPr>
+        <w:rFonts w:ascii="Wingdings" w:hAnsi="Wingdings" w:hint="default"/>
+        <w:sz w:val="20"/>
+      </w:rPr>
+    </w:lvl>
+  </w:abstractNum>
+  <w:abstractNum w:abstractNumId="12" w15:restartNumberingAfterBreak="0">
+    <w:nsid w:val="77B5378A"/>
+    <w:multiLevelType w:val="multilevel"/>
+    <w:tmpl w:val="DF94E1C4"/>
+    <w:lvl w:ilvl="0">
+      <w:start w:val="1"/>
+      <w:numFmt w:val="bullet"/>
+      <w:lvlText w:val=""/>
+      <w:lvlJc w:val="left"/>
+      <w:pPr>
+        <w:tabs>
+          <w:tab w:val="num" w:pos="720"/>
+        </w:tabs>
+        <w:ind w:left="720" w:hanging="360"/>
+      </w:pPr>
+      <w:rPr>
+        <w:rFonts w:ascii="Symbol" w:hAnsi="Symbol" w:hint="default"/>
+        <w:sz w:val="20"/>
+      </w:rPr>
+    </w:lvl>
+    <w:lvl w:ilvl="1" w:tentative="1">
+      <w:start w:val="1"/>
+      <w:numFmt w:val="bullet"/>
+      <w:lvlText w:val="o"/>
+      <w:lvlJc w:val="left"/>
+      <w:pPr>
+        <w:tabs>
+          <w:tab w:val="num" w:pos="1440"/>
+        </w:tabs>
+        <w:ind w:left="1440" w:hanging="360"/>
+      </w:pPr>
+      <w:rPr>
+        <w:rFonts w:ascii="Courier New" w:hAnsi="Courier New" w:hint="default"/>
+        <w:sz w:val="20"/>
+      </w:rPr>
+    </w:lvl>
+    <w:lvl w:ilvl="2" w:tentative="1">
+      <w:start w:val="1"/>
+      <w:numFmt w:val="bullet"/>
+      <w:lvlText w:val=""/>
+      <w:lvlJc w:val="left"/>
+      <w:pPr>
+        <w:tabs>
+          <w:tab w:val="num" w:pos="2160"/>
+        </w:tabs>
+        <w:ind w:left="2160" w:hanging="360"/>
+      </w:pPr>
+      <w:rPr>
+        <w:rFonts w:ascii="Wingdings" w:hAnsi="Wingdings" w:hint="default"/>
+        <w:sz w:val="20"/>
+      </w:rPr>
+    </w:lvl>
+    <w:lvl w:ilvl="3" w:tentative="1">
+      <w:start w:val="1"/>
+      <w:numFmt w:val="bullet"/>
+      <w:lvlText w:val=""/>
+      <w:lvlJc w:val="left"/>
+      <w:pPr>
+        <w:tabs>
+          <w:tab w:val="num" w:pos="2880"/>
+        </w:tabs>
+        <w:ind w:left="2880" w:hanging="360"/>
+      </w:pPr>
+      <w:rPr>
+        <w:rFonts w:ascii="Wingdings" w:hAnsi="Wingdings" w:hint="default"/>
+        <w:sz w:val="20"/>
+      </w:rPr>
+    </w:lvl>
+    <w:lvl w:ilvl="4" w:tentative="1">
+      <w:start w:val="1"/>
+      <w:numFmt w:val="bullet"/>
+      <w:lvlText w:val=""/>
+      <w:lvlJc w:val="left"/>
+      <w:pPr>
+        <w:tabs>
+          <w:tab w:val="num" w:pos="3600"/>
+        </w:tabs>
+        <w:ind w:left="3600" w:hanging="360"/>
+      </w:pPr>
+      <w:rPr>
+        <w:rFonts w:ascii="Wingdings" w:hAnsi="Wingdings" w:hint="default"/>
+        <w:sz w:val="20"/>
+      </w:rPr>
+    </w:lvl>
+    <w:lvl w:ilvl="5" w:tentative="1">
+      <w:start w:val="1"/>
+      <w:numFmt w:val="bullet"/>
+      <w:lvlText w:val=""/>
+      <w:lvlJc w:val="left"/>
+      <w:pPr>
+        <w:tabs>
+          <w:tab w:val="num" w:pos="4320"/>
+        </w:tabs>
+        <w:ind w:left="4320" w:hanging="360"/>
+      </w:pPr>
+      <w:rPr>
+        <w:rFonts w:ascii="Wingdings" w:hAnsi="Wingdings" w:hint="default"/>
+        <w:sz w:val="20"/>
+      </w:rPr>
+    </w:lvl>
+    <w:lvl w:ilvl="6" w:tentative="1">
+      <w:start w:val="1"/>
+      <w:numFmt w:val="bullet"/>
+      <w:lvlText w:val=""/>
+      <w:lvlJc w:val="left"/>
+      <w:pPr>
+        <w:tabs>
+          <w:tab w:val="num" w:pos="5040"/>
+        </w:tabs>
+        <w:ind w:left="5040" w:hanging="360"/>
+      </w:pPr>
+      <w:rPr>
+        <w:rFonts w:ascii="Wingdings" w:hAnsi="Wingdings" w:hint="default"/>
+        <w:sz w:val="20"/>
+      </w:rPr>
+    </w:lvl>
+    <w:lvl w:ilvl="7" w:tentative="1">
+      <w:start w:val="1"/>
+      <w:numFmt w:val="bullet"/>
+      <w:lvlText w:val=""/>
+      <w:lvlJc w:val="left"/>
+      <w:pPr>
+        <w:tabs>
+          <w:tab w:val="num" w:pos="5760"/>
+        </w:tabs>
+        <w:ind w:left="5760" w:hanging="360"/>
+      </w:pPr>
+      <w:rPr>
+        <w:rFonts w:ascii="Wingdings" w:hAnsi="Wingdings" w:hint="default"/>
+        <w:sz w:val="20"/>
+      </w:rPr>
+    </w:lvl>
+    <w:lvl w:ilvl="8" w:tentative="1">
+      <w:start w:val="1"/>
+      <w:numFmt w:val="bullet"/>
+      <w:lvlText w:val=""/>
+      <w:lvlJc w:val="left"/>
+      <w:pPr>
+        <w:tabs>
+          <w:tab w:val="num" w:pos="6480"/>
+        </w:tabs>
+        <w:ind w:left="6480" w:hanging="360"/>
+      </w:pPr>
+      <w:rPr>
+        <w:rFonts w:ascii="Wingdings" w:hAnsi="Wingdings" w:hint="default"/>
+        <w:sz w:val="20"/>
+      </w:rPr>
     </w:lvl>
   </w:abstractNum>
   <w:num w:numId="1" w16cid:durableId="636302049">
@@ -3579,13 +3027,13 @@
     <w:abstractNumId w:val="5"/>
   </w:num>
   <w:num w:numId="3" w16cid:durableId="464080542">
-    <w:abstractNumId w:val="9"/>
+    <w:abstractNumId w:val="10"/>
   </w:num>
   <w:num w:numId="4" w16cid:durableId="1792894366">
     <w:abstractNumId w:val="2"/>
   </w:num>
   <w:num w:numId="5" w16cid:durableId="521092250">
-    <w:abstractNumId w:val="8"/>
+    <w:abstractNumId w:val="9"/>
   </w:num>
   <w:num w:numId="6" w16cid:durableId="1731269288">
     <w:abstractNumId w:val="0"/>
@@ -3628,6 +3076,15 @@
   </w:num>
   <w:num w:numId="10" w16cid:durableId="1190071664">
     <w:abstractNumId w:val="3"/>
+  </w:num>
+  <w:num w:numId="11" w16cid:durableId="1792091006">
+    <w:abstractNumId w:val="11"/>
+  </w:num>
+  <w:num w:numId="12" w16cid:durableId="605162869">
+    <w:abstractNumId w:val="8"/>
+  </w:num>
+  <w:num w:numId="13" w16cid:durableId="1374115523">
+    <w:abstractNumId w:val="12"/>
   </w:num>
 </w:numbering>
 </file>
@@ -4232,6 +3689,7 @@
   <w:style w:type="character" w:default="1" w:styleId="DefaultParagraphFont">
     <w:name w:val="Default Paragraph Font"/>
     <w:uiPriority w:val="1"/>
+    <w:semiHidden/>
     <w:unhideWhenUsed/>
   </w:style>
   <w:style w:type="table" w:default="1" w:styleId="TableNormal">

</xml_diff>